<commit_message>
Finalized home page, worked on addCourse, started CSS
I started brainstorming some ideas for the CSS and attached it to the addCourse page. As I develop it further, I will link in into the other pages as well.
</commit_message>
<xml_diff>
--- a/CSCI 330 Carrier Module One AI Usage Report.docx
+++ b/CSCI 330 Carrier Module One AI Usage Report.docx
@@ -766,19 +766,7 @@
         <w:rPr>
           <w:rFonts w:ascii="Times New Roman" w:hAnsi="Times New Roman" w:cs="Times New Roman"/>
         </w:rPr>
-        <w:t xml:space="preserve"> </w:t>
-      </w:r>
-      <w:r>
-        <w:rPr>
-          <w:rFonts w:ascii="Times New Roman" w:hAnsi="Times New Roman" w:cs="Times New Roman"/>
-        </w:rPr>
-        <w:t>More i</w:t>
-      </w:r>
-      <w:r>
-        <w:rPr>
-          <w:rFonts w:ascii="Times New Roman" w:hAnsi="Times New Roman" w:cs="Times New Roman"/>
-        </w:rPr>
-        <w:t>nformation about IDs</w:t>
+        <w:t xml:space="preserve"> More information about IDs</w:t>
       </w:r>
     </w:p>
     <w:p>
@@ -822,13 +810,7 @@
         <w:rPr>
           <w:rFonts w:ascii="Times New Roman" w:hAnsi="Times New Roman" w:cs="Times New Roman"/>
         </w:rPr>
-        <w:t xml:space="preserve"> </w:t>
-      </w:r>
-      <w:r>
-        <w:rPr>
-          <w:rFonts w:ascii="Times New Roman" w:hAnsi="Times New Roman" w:cs="Times New Roman"/>
-        </w:rPr>
-        <w:t>Do ids have to be unique across all pages?</w:t>
+        <w:t xml:space="preserve"> Do ids have to be unique across all pages?</w:t>
       </w:r>
     </w:p>
     <w:p>
@@ -850,13 +832,7 @@
         <w:rPr>
           <w:rFonts w:ascii="Times New Roman" w:hAnsi="Times New Roman" w:cs="Times New Roman"/>
         </w:rPr>
-        <w:t xml:space="preserve"> </w:t>
-      </w:r>
-      <w:r>
-        <w:rPr>
-          <w:rFonts w:ascii="Times New Roman" w:hAnsi="Times New Roman" w:cs="Times New Roman"/>
-        </w:rPr>
-        <w:t xml:space="preserve">No, ids only need to be unique </w:t>
+        <w:t xml:space="preserve"> No, ids only need to be unique </w:t>
       </w:r>
       <w:r>
         <w:rPr>
@@ -943,13 +919,7 @@
         <w:rPr>
           <w:rFonts w:ascii="Times New Roman" w:hAnsi="Times New Roman" w:cs="Times New Roman"/>
         </w:rPr>
-        <w:t xml:space="preserve"> </w:t>
-      </w:r>
-      <w:r>
-        <w:rPr>
-          <w:rFonts w:ascii="Times New Roman" w:hAnsi="Times New Roman" w:cs="Times New Roman"/>
-        </w:rPr>
-        <w:t xml:space="preserve">Understand </w:t>
+        <w:t xml:space="preserve"> Understand </w:t>
       </w:r>
       <w:r>
         <w:rPr>
@@ -1121,19 +1091,7 @@
         <w:rPr>
           <w:rFonts w:ascii="Times New Roman" w:hAnsi="Times New Roman" w:cs="Times New Roman"/>
         </w:rPr>
-        <w:t xml:space="preserve"> </w:t>
-      </w:r>
-      <w:r>
-        <w:rPr>
-          <w:rFonts w:ascii="Times New Roman" w:hAnsi="Times New Roman" w:cs="Times New Roman"/>
-        </w:rPr>
-        <w:t>More i</w:t>
-      </w:r>
-      <w:r>
-        <w:rPr>
-          <w:rFonts w:ascii="Times New Roman" w:hAnsi="Times New Roman" w:cs="Times New Roman"/>
-        </w:rPr>
-        <w:t>nformation about IDs</w:t>
+        <w:t xml:space="preserve"> More information about IDs</w:t>
       </w:r>
     </w:p>
     <w:p>
@@ -1177,13 +1135,7 @@
         <w:rPr>
           <w:rFonts w:ascii="Times New Roman" w:hAnsi="Times New Roman" w:cs="Times New Roman"/>
         </w:rPr>
-        <w:t xml:space="preserve"> </w:t>
-      </w:r>
-      <w:r>
-        <w:rPr>
-          <w:rFonts w:ascii="Times New Roman" w:hAnsi="Times New Roman" w:cs="Times New Roman"/>
-        </w:rPr>
-        <w:t>Can id attributes contain spaces?</w:t>
+        <w:t xml:space="preserve"> Can id attributes contain spaces?</w:t>
       </w:r>
     </w:p>
     <w:p>
@@ -1297,6 +1249,12 @@
         </w:rPr>
         <w:t xml:space="preserve"> </w:t>
       </w:r>
+      <w:r>
+        <w:rPr>
+          <w:rFonts w:ascii="Times New Roman" w:hAnsi="Times New Roman" w:cs="Times New Roman"/>
+        </w:rPr>
+        <w:t>ChatGPT</w:t>
+      </w:r>
     </w:p>
     <w:p>
       <w:pPr>
@@ -1319,6 +1277,12 @@
         </w:rPr>
         <w:t xml:space="preserve"> </w:t>
       </w:r>
+      <w:r>
+        <w:rPr>
+          <w:rFonts w:ascii="Times New Roman" w:hAnsi="Times New Roman" w:cs="Times New Roman"/>
+        </w:rPr>
+        <w:t>getting started with CSS</w:t>
+      </w:r>
     </w:p>
     <w:p>
       <w:pPr>
@@ -1341,6 +1305,12 @@
         </w:rPr>
         <w:t xml:space="preserve"> </w:t>
       </w:r>
+      <w:r>
+        <w:rPr>
+          <w:rFonts w:ascii="Times New Roman" w:hAnsi="Times New Roman" w:cs="Times New Roman"/>
+        </w:rPr>
+        <w:t>moduleOne.css</w:t>
+      </w:r>
     </w:p>
     <w:p>
       <w:pPr>
@@ -1363,6 +1333,12 @@
         </w:rPr>
         <w:t xml:space="preserve"> </w:t>
       </w:r>
+      <w:r>
+        <w:rPr>
+          <w:rFonts w:ascii="Times New Roman" w:hAnsi="Times New Roman" w:cs="Times New Roman"/>
+        </w:rPr>
+        <w:t>how do I start a CSS file?</w:t>
+      </w:r>
     </w:p>
     <w:p>
       <w:pPr>
@@ -1385,14 +1361,36 @@
         </w:rPr>
         <w:t xml:space="preserve"> </w:t>
       </w:r>
-    </w:p>
-    <w:p>
-      <w:pPr>
-        <w:spacing w:line="480" w:lineRule="auto"/>
-        <w:rPr>
-          <w:rFonts w:ascii="Times New Roman" w:hAnsi="Times New Roman" w:cs="Times New Roman"/>
-          <w:b/>
-          <w:bCs/>
+      <w:r>
+        <w:rPr>
+          <w:rFonts w:ascii="Times New Roman" w:hAnsi="Times New Roman" w:cs="Times New Roman"/>
+        </w:rPr>
+        <w:t xml:space="preserve">To start a CSS, </w:t>
+      </w:r>
+      <w:r>
+        <w:rPr>
+          <w:rFonts w:ascii="Times New Roman" w:hAnsi="Times New Roman" w:cs="Times New Roman"/>
+        </w:rPr>
+        <w:t xml:space="preserve">you just have to create a file ending with .css. From there, you can </w:t>
+      </w:r>
+      <w:r>
+        <w:rPr>
+          <w:rFonts w:ascii="Times New Roman" w:hAnsi="Times New Roman" w:cs="Times New Roman"/>
+        </w:rPr>
+        <w:t xml:space="preserve">write all of your style rules. To see the sheet applied to your HTML files, use the &lt;link&gt; tags </w:t>
+      </w:r>
+      <w:r>
+        <w:rPr>
+          <w:rFonts w:ascii="Times New Roman" w:hAnsi="Times New Roman" w:cs="Times New Roman"/>
+        </w:rPr>
+        <w:t xml:space="preserve">in the &lt;head&gt; element. </w:t>
+      </w:r>
+    </w:p>
+    <w:p>
+      <w:pPr>
+        <w:spacing w:line="480" w:lineRule="auto"/>
+        <w:rPr>
+          <w:rFonts w:ascii="Times New Roman" w:hAnsi="Times New Roman" w:cs="Times New Roman"/>
         </w:rPr>
       </w:pPr>
       <w:r>
@@ -1410,6 +1408,18 @@
           <w:bCs/>
         </w:rPr>
         <w:t xml:space="preserve"> </w:t>
+      </w:r>
+      <w:r>
+        <w:rPr>
+          <w:rFonts w:ascii="Times New Roman" w:hAnsi="Times New Roman" w:cs="Times New Roman"/>
+        </w:rPr>
+        <w:t xml:space="preserve"> I used this response directly to create and start my CSS sheet. I didn’t copy anything from the AI model, but I used all the principles it stated to </w:t>
+      </w:r>
+      <w:r>
+        <w:rPr>
+          <w:rFonts w:ascii="Times New Roman" w:hAnsi="Times New Roman" w:cs="Times New Roman"/>
+        </w:rPr>
+        <w:t xml:space="preserve">get started on the CSS sheet. </w:t>
       </w:r>
     </w:p>
     <w:p>
@@ -1451,6 +1461,12 @@
         </w:rPr>
         <w:t xml:space="preserve"> </w:t>
       </w:r>
+      <w:r>
+        <w:rPr>
+          <w:rFonts w:ascii="Times New Roman" w:hAnsi="Times New Roman" w:cs="Times New Roman"/>
+        </w:rPr>
+        <w:t>ChatGPT</w:t>
+      </w:r>
     </w:p>
     <w:p>
       <w:pPr>
@@ -1473,6 +1489,12 @@
         </w:rPr>
         <w:t xml:space="preserve"> </w:t>
       </w:r>
+      <w:r>
+        <w:rPr>
+          <w:rFonts w:ascii="Times New Roman" w:hAnsi="Times New Roman" w:cs="Times New Roman"/>
+        </w:rPr>
+        <w:t>Editing fonts to practice with CSS</w:t>
+      </w:r>
     </w:p>
     <w:p>
       <w:pPr>
@@ -1495,6 +1517,12 @@
         </w:rPr>
         <w:t xml:space="preserve"> </w:t>
       </w:r>
+      <w:r>
+        <w:rPr>
+          <w:rFonts w:ascii="Times New Roman" w:hAnsi="Times New Roman" w:cs="Times New Roman"/>
+        </w:rPr>
+        <w:t>moduleOne.css</w:t>
+      </w:r>
     </w:p>
     <w:p>
       <w:pPr>
@@ -1517,6 +1545,12 @@
         </w:rPr>
         <w:t xml:space="preserve"> </w:t>
       </w:r>
+      <w:r>
+        <w:rPr>
+          <w:rFonts w:ascii="Times New Roman" w:hAnsi="Times New Roman" w:cs="Times New Roman"/>
+        </w:rPr>
+        <w:t>Suggest some fonts (provide the names that a browser would recognize) for my course registration site</w:t>
+      </w:r>
     </w:p>
     <w:p>
       <w:pPr>
@@ -1539,6 +1573,18 @@
         </w:rPr>
         <w:t xml:space="preserve"> </w:t>
       </w:r>
+      <w:r>
+        <w:rPr>
+          <w:rFonts w:ascii="Times New Roman" w:hAnsi="Times New Roman" w:cs="Times New Roman"/>
+        </w:rPr>
+        <w:t xml:space="preserve">The model suggested multiple </w:t>
+      </w:r>
+      <w:r>
+        <w:rPr>
+          <w:rFonts w:ascii="Times New Roman" w:hAnsi="Times New Roman" w:cs="Times New Roman"/>
+        </w:rPr>
+        <w:t xml:space="preserve">fonts that would give the page a polished, academic feel. </w:t>
+      </w:r>
     </w:p>
     <w:p>
       <w:pPr>
@@ -1555,6 +1601,398 @@
         </w:rPr>
         <w:t>How was the response used (directly, modified, discarded)? Explain.</w:t>
       </w:r>
+      <w:r>
+        <w:rPr>
+          <w:rFonts w:ascii="Times New Roman" w:hAnsi="Times New Roman" w:cs="Times New Roman"/>
+          <w:b/>
+          <w:bCs/>
+        </w:rPr>
+        <w:t xml:space="preserve"> </w:t>
+      </w:r>
+      <w:r>
+        <w:rPr>
+          <w:rFonts w:ascii="Times New Roman" w:hAnsi="Times New Roman" w:cs="Times New Roman"/>
+        </w:rPr>
+        <w:t xml:space="preserve">I used some of the suggested fonts to create a font-family </w:t>
+      </w:r>
+      <w:r>
+        <w:rPr>
+          <w:rFonts w:ascii="Times New Roman" w:hAnsi="Times New Roman" w:cs="Times New Roman"/>
+        </w:rPr>
+        <w:t>property.</w:t>
+      </w:r>
+    </w:p>
+    <w:p>
+      <w:pPr>
+        <w:rPr>
+          <w:rFonts w:ascii="Times New Roman" w:hAnsi="Times New Roman" w:cs="Times New Roman"/>
+        </w:rPr>
+      </w:pPr>
+      <w:r>
+        <w:rPr>
+          <w:rFonts w:ascii="Times New Roman" w:hAnsi="Times New Roman" w:cs="Times New Roman"/>
+        </w:rPr>
+        <w:br w:type="page"/>
+      </w:r>
+    </w:p>
+    <w:p>
+      <w:pPr>
+        <w:spacing w:line="480" w:lineRule="auto"/>
+        <w:rPr>
+          <w:rFonts w:ascii="Times New Roman" w:hAnsi="Times New Roman" w:cs="Times New Roman"/>
+        </w:rPr>
+      </w:pPr>
+      <w:r>
+        <w:rPr>
+          <w:rFonts w:ascii="Times New Roman" w:hAnsi="Times New Roman" w:cs="Times New Roman"/>
+          <w:b/>
+          <w:bCs/>
+        </w:rPr>
+        <w:lastRenderedPageBreak/>
+        <w:t>AI Tool used:</w:t>
+      </w:r>
+      <w:r>
+        <w:rPr>
+          <w:rFonts w:ascii="Times New Roman" w:hAnsi="Times New Roman" w:cs="Times New Roman"/>
+        </w:rPr>
+        <w:t xml:space="preserve"> </w:t>
+      </w:r>
+      <w:r>
+        <w:rPr>
+          <w:rFonts w:ascii="Times New Roman" w:hAnsi="Times New Roman" w:cs="Times New Roman"/>
+        </w:rPr>
+        <w:t>ChatGPT</w:t>
+      </w:r>
+    </w:p>
+    <w:p>
+      <w:pPr>
+        <w:spacing w:line="480" w:lineRule="auto"/>
+        <w:rPr>
+          <w:rFonts w:ascii="Times New Roman" w:hAnsi="Times New Roman" w:cs="Times New Roman"/>
+        </w:rPr>
+      </w:pPr>
+      <w:r>
+        <w:rPr>
+          <w:rFonts w:ascii="Times New Roman" w:hAnsi="Times New Roman" w:cs="Times New Roman"/>
+          <w:b/>
+          <w:bCs/>
+        </w:rPr>
+        <w:t>Task being performed:</w:t>
+      </w:r>
+      <w:r>
+        <w:rPr>
+          <w:rFonts w:ascii="Times New Roman" w:hAnsi="Times New Roman" w:cs="Times New Roman"/>
+        </w:rPr>
+        <w:t xml:space="preserve"> </w:t>
+      </w:r>
+      <w:r>
+        <w:rPr>
+          <w:rFonts w:ascii="Times New Roman" w:hAnsi="Times New Roman" w:cs="Times New Roman"/>
+        </w:rPr>
+        <w:t>Getting started with the CSS development process</w:t>
+      </w:r>
+    </w:p>
+    <w:p>
+      <w:pPr>
+        <w:spacing w:line="480" w:lineRule="auto"/>
+        <w:rPr>
+          <w:rFonts w:ascii="Times New Roman" w:hAnsi="Times New Roman" w:cs="Times New Roman"/>
+        </w:rPr>
+      </w:pPr>
+      <w:r>
+        <w:rPr>
+          <w:rFonts w:ascii="Times New Roman" w:hAnsi="Times New Roman" w:cs="Times New Roman"/>
+          <w:b/>
+          <w:bCs/>
+        </w:rPr>
+        <w:t>File associated with task:</w:t>
+      </w:r>
+      <w:r>
+        <w:rPr>
+          <w:rFonts w:ascii="Times New Roman" w:hAnsi="Times New Roman" w:cs="Times New Roman"/>
+        </w:rPr>
+        <w:t xml:space="preserve"> </w:t>
+      </w:r>
+      <w:r>
+        <w:rPr>
+          <w:rFonts w:ascii="Times New Roman" w:hAnsi="Times New Roman" w:cs="Times New Roman"/>
+        </w:rPr>
+        <w:t>moduleOne.css</w:t>
+      </w:r>
+    </w:p>
+    <w:p>
+      <w:pPr>
+        <w:spacing w:line="480" w:lineRule="auto"/>
+        <w:rPr>
+          <w:rFonts w:ascii="Times New Roman" w:hAnsi="Times New Roman" w:cs="Times New Roman"/>
+        </w:rPr>
+      </w:pPr>
+      <w:r>
+        <w:rPr>
+          <w:rFonts w:ascii="Times New Roman" w:hAnsi="Times New Roman" w:cs="Times New Roman"/>
+          <w:b/>
+          <w:bCs/>
+        </w:rPr>
+        <w:t>Prompt/question provided:</w:t>
+      </w:r>
+      <w:r>
+        <w:rPr>
+          <w:rFonts w:ascii="Times New Roman" w:hAnsi="Times New Roman" w:cs="Times New Roman"/>
+        </w:rPr>
+        <w:t xml:space="preserve"> </w:t>
+      </w:r>
+      <w:r>
+        <w:rPr>
+          <w:rFonts w:ascii="Times New Roman" w:hAnsi="Times New Roman" w:cs="Times New Roman"/>
+        </w:rPr>
+        <w:t>I'm feeling a little overwhelmed by all the possibilities of CSS. I don't really know what I want my site to look like yet, so I don't know what properties to include in each of my selectors. Can you provide some suggestions on how to progress through CSS development?</w:t>
+      </w:r>
+    </w:p>
+    <w:p>
+      <w:pPr>
+        <w:spacing w:line="480" w:lineRule="auto"/>
+        <w:rPr>
+          <w:rFonts w:ascii="Times New Roman" w:hAnsi="Times New Roman" w:cs="Times New Roman"/>
+        </w:rPr>
+      </w:pPr>
+      <w:r>
+        <w:rPr>
+          <w:rFonts w:ascii="Times New Roman" w:hAnsi="Times New Roman" w:cs="Times New Roman"/>
+          <w:b/>
+          <w:bCs/>
+        </w:rPr>
+        <w:t>Summary of the response:</w:t>
+      </w:r>
+      <w:r>
+        <w:rPr>
+          <w:rFonts w:ascii="Times New Roman" w:hAnsi="Times New Roman" w:cs="Times New Roman"/>
+        </w:rPr>
+        <w:t xml:space="preserve"> </w:t>
+      </w:r>
+      <w:r>
+        <w:rPr>
+          <w:rFonts w:ascii="Times New Roman" w:hAnsi="Times New Roman" w:cs="Times New Roman"/>
+        </w:rPr>
+        <w:t xml:space="preserve">The model suggested a simple 6-stage process I can try to follow to create my CSS. </w:t>
+      </w:r>
+      <w:r>
+        <w:rPr>
+          <w:rFonts w:ascii="Times New Roman" w:hAnsi="Times New Roman" w:cs="Times New Roman"/>
+        </w:rPr>
+        <w:t xml:space="preserve">The stages are: structure, layout, typography, color, spacing, and details (in that order). It also provided me with some sample code and questions to consider about my desires for each page/element. </w:t>
+      </w:r>
+    </w:p>
+    <w:p>
+      <w:pPr>
+        <w:spacing w:line="480" w:lineRule="auto"/>
+        <w:rPr>
+          <w:rFonts w:ascii="Times New Roman" w:hAnsi="Times New Roman" w:cs="Times New Roman"/>
+        </w:rPr>
+      </w:pPr>
+      <w:r>
+        <w:rPr>
+          <w:rFonts w:ascii="Times New Roman" w:hAnsi="Times New Roman" w:cs="Times New Roman"/>
+          <w:b/>
+          <w:bCs/>
+        </w:rPr>
+        <w:t>How was the response used (directly, modified, discarded)? Explain.</w:t>
+      </w:r>
+      <w:r>
+        <w:rPr>
+          <w:rFonts w:ascii="Times New Roman" w:hAnsi="Times New Roman" w:cs="Times New Roman"/>
+          <w:b/>
+          <w:bCs/>
+        </w:rPr>
+        <w:t xml:space="preserve"> </w:t>
+      </w:r>
+      <w:r>
+        <w:rPr>
+          <w:rFonts w:ascii="Times New Roman" w:hAnsi="Times New Roman" w:cs="Times New Roman"/>
+        </w:rPr>
+        <w:t xml:space="preserve">I applied the ideas and suggestions </w:t>
+      </w:r>
+      <w:r>
+        <w:rPr>
+          <w:rFonts w:ascii="Times New Roman" w:hAnsi="Times New Roman" w:cs="Times New Roman"/>
+        </w:rPr>
+        <w:t xml:space="preserve">to my CSS </w:t>
+      </w:r>
+      <w:r>
+        <w:rPr>
+          <w:rFonts w:ascii="Times New Roman" w:hAnsi="Times New Roman" w:cs="Times New Roman"/>
+        </w:rPr>
+        <w:t>by</w:t>
+      </w:r>
+      <w:r>
+        <w:rPr>
+          <w:rFonts w:ascii="Times New Roman" w:hAnsi="Times New Roman" w:cs="Times New Roman"/>
+        </w:rPr>
+        <w:t xml:space="preserve"> us</w:t>
+      </w:r>
+      <w:r>
+        <w:rPr>
+          <w:rFonts w:ascii="Times New Roman" w:hAnsi="Times New Roman" w:cs="Times New Roman"/>
+        </w:rPr>
+        <w:t>ing</w:t>
+      </w:r>
+      <w:r>
+        <w:rPr>
+          <w:rFonts w:ascii="Times New Roman" w:hAnsi="Times New Roman" w:cs="Times New Roman"/>
+        </w:rPr>
+        <w:t xml:space="preserve"> the logical flow suggestion to help me make a plan of attack for developing the sheet. </w:t>
+      </w:r>
+    </w:p>
+    <w:p>
+      <w:pPr>
+        <w:rPr>
+          <w:rFonts w:ascii="Times New Roman" w:hAnsi="Times New Roman" w:cs="Times New Roman"/>
+          <w:b/>
+          <w:bCs/>
+        </w:rPr>
+      </w:pPr>
+      <w:r>
+        <w:rPr>
+          <w:rFonts w:ascii="Times New Roman" w:hAnsi="Times New Roman" w:cs="Times New Roman"/>
+          <w:b/>
+          <w:bCs/>
+        </w:rPr>
+        <w:br w:type="page"/>
+      </w:r>
+    </w:p>
+    <w:p>
+      <w:pPr>
+        <w:spacing w:line="480" w:lineRule="auto"/>
+        <w:rPr>
+          <w:rFonts w:ascii="Times New Roman" w:hAnsi="Times New Roman" w:cs="Times New Roman"/>
+        </w:rPr>
+      </w:pPr>
+      <w:r>
+        <w:rPr>
+          <w:rFonts w:ascii="Times New Roman" w:hAnsi="Times New Roman" w:cs="Times New Roman"/>
+          <w:b/>
+          <w:bCs/>
+        </w:rPr>
+        <w:lastRenderedPageBreak/>
+        <w:t>AI Tool used:</w:t>
+      </w:r>
+      <w:r>
+        <w:rPr>
+          <w:rFonts w:ascii="Times New Roman" w:hAnsi="Times New Roman" w:cs="Times New Roman"/>
+        </w:rPr>
+        <w:t xml:space="preserve"> </w:t>
+      </w:r>
+    </w:p>
+    <w:p>
+      <w:pPr>
+        <w:spacing w:line="480" w:lineRule="auto"/>
+        <w:rPr>
+          <w:rFonts w:ascii="Times New Roman" w:hAnsi="Times New Roman" w:cs="Times New Roman"/>
+        </w:rPr>
+      </w:pPr>
+      <w:r>
+        <w:rPr>
+          <w:rFonts w:ascii="Times New Roman" w:hAnsi="Times New Roman" w:cs="Times New Roman"/>
+          <w:b/>
+          <w:bCs/>
+        </w:rPr>
+        <w:t>Task being performed:</w:t>
+      </w:r>
+      <w:r>
+        <w:rPr>
+          <w:rFonts w:ascii="Times New Roman" w:hAnsi="Times New Roman" w:cs="Times New Roman"/>
+        </w:rPr>
+        <w:t xml:space="preserve"> </w:t>
+      </w:r>
+    </w:p>
+    <w:p>
+      <w:pPr>
+        <w:spacing w:line="480" w:lineRule="auto"/>
+        <w:rPr>
+          <w:rFonts w:ascii="Times New Roman" w:hAnsi="Times New Roman" w:cs="Times New Roman"/>
+        </w:rPr>
+      </w:pPr>
+      <w:r>
+        <w:rPr>
+          <w:rFonts w:ascii="Times New Roman" w:hAnsi="Times New Roman" w:cs="Times New Roman"/>
+          <w:b/>
+          <w:bCs/>
+        </w:rPr>
+        <w:t>File associated with task:</w:t>
+      </w:r>
+      <w:r>
+        <w:rPr>
+          <w:rFonts w:ascii="Times New Roman" w:hAnsi="Times New Roman" w:cs="Times New Roman"/>
+        </w:rPr>
+        <w:t xml:space="preserve"> </w:t>
+      </w:r>
+    </w:p>
+    <w:p>
+      <w:pPr>
+        <w:spacing w:line="480" w:lineRule="auto"/>
+        <w:rPr>
+          <w:rFonts w:ascii="Times New Roman" w:hAnsi="Times New Roman" w:cs="Times New Roman"/>
+        </w:rPr>
+      </w:pPr>
+      <w:r>
+        <w:rPr>
+          <w:rFonts w:ascii="Times New Roman" w:hAnsi="Times New Roman" w:cs="Times New Roman"/>
+          <w:b/>
+          <w:bCs/>
+        </w:rPr>
+        <w:t>Prompt/question provided:</w:t>
+      </w:r>
+      <w:r>
+        <w:rPr>
+          <w:rFonts w:ascii="Times New Roman" w:hAnsi="Times New Roman" w:cs="Times New Roman"/>
+        </w:rPr>
+        <w:t xml:space="preserve"> </w:t>
+      </w:r>
+    </w:p>
+    <w:p>
+      <w:pPr>
+        <w:spacing w:line="480" w:lineRule="auto"/>
+        <w:rPr>
+          <w:rFonts w:ascii="Times New Roman" w:hAnsi="Times New Roman" w:cs="Times New Roman"/>
+        </w:rPr>
+      </w:pPr>
+      <w:r>
+        <w:rPr>
+          <w:rFonts w:ascii="Times New Roman" w:hAnsi="Times New Roman" w:cs="Times New Roman"/>
+          <w:b/>
+          <w:bCs/>
+        </w:rPr>
+        <w:t>Summary of the response:</w:t>
+      </w:r>
+      <w:r>
+        <w:rPr>
+          <w:rFonts w:ascii="Times New Roman" w:hAnsi="Times New Roman" w:cs="Times New Roman"/>
+        </w:rPr>
+        <w:t xml:space="preserve"> </w:t>
+      </w:r>
+    </w:p>
+    <w:p>
+      <w:pPr>
+        <w:spacing w:line="480" w:lineRule="auto"/>
+        <w:rPr>
+          <w:rFonts w:ascii="Times New Roman" w:hAnsi="Times New Roman" w:cs="Times New Roman"/>
+        </w:rPr>
+      </w:pPr>
+      <w:r>
+        <w:rPr>
+          <w:rFonts w:ascii="Times New Roman" w:hAnsi="Times New Roman" w:cs="Times New Roman"/>
+          <w:b/>
+          <w:bCs/>
+        </w:rPr>
+        <w:t>How was the response used (directly, modified, discarded)? Explain.</w:t>
+      </w:r>
+    </w:p>
+    <w:p>
+      <w:pPr>
+        <w:spacing w:line="480" w:lineRule="auto"/>
+        <w:rPr>
+          <w:rFonts w:ascii="Times New Roman" w:hAnsi="Times New Roman" w:cs="Times New Roman"/>
+        </w:rPr>
+      </w:pPr>
     </w:p>
     <w:p>
       <w:pPr>

</xml_diff>

<commit_message>
More CSS work, edited pages to have matching headers
Also added name attributes to all inputs on addCourse. Working on getting familiar with CSS and having all pages aligned. Note: I removed the <main> tags from the addinstructor and enrollstudent pages. They were causing the CSS to not be applied, and since these pages only have the form in them (for now), we don't have any additional content in these pages... so I'm not sure we need the main tags, but we can talk to Dr. Williamson about it soon to make sure
</commit_message>
<xml_diff>
--- a/CSCI 330 Carrier Module One AI Usage Report.docx
+++ b/CSCI 330 Carrier Module One AI Usage Report.docx
@@ -1371,7 +1371,21 @@
         <w:rPr>
           <w:rFonts w:ascii="Times New Roman" w:hAnsi="Times New Roman" w:cs="Times New Roman"/>
         </w:rPr>
-        <w:t xml:space="preserve">you just have to create a file ending with .css. From there, you can </w:t>
+        <w:t>you just have to create a file ending with .</w:t>
+      </w:r>
+      <w:proofErr w:type="spellStart"/>
+      <w:r>
+        <w:rPr>
+          <w:rFonts w:ascii="Times New Roman" w:hAnsi="Times New Roman" w:cs="Times New Roman"/>
+        </w:rPr>
+        <w:t>css</w:t>
+      </w:r>
+      <w:proofErr w:type="spellEnd"/>
+      <w:r>
+        <w:rPr>
+          <w:rFonts w:ascii="Times New Roman" w:hAnsi="Times New Roman" w:cs="Times New Roman"/>
+        </w:rPr>
+        <w:t xml:space="preserve">. From there, you can </w:t>
       </w:r>
       <w:r>
         <w:rPr>
@@ -1881,6 +1895,12 @@
         </w:rPr>
         <w:t xml:space="preserve"> </w:t>
       </w:r>
+      <w:r>
+        <w:rPr>
+          <w:rFonts w:ascii="Times New Roman" w:hAnsi="Times New Roman" w:cs="Times New Roman"/>
+        </w:rPr>
+        <w:t>ChatGPT</w:t>
+      </w:r>
     </w:p>
     <w:p>
       <w:pPr>
@@ -1903,6 +1923,12 @@
         </w:rPr>
         <w:t xml:space="preserve"> </w:t>
       </w:r>
+      <w:r>
+        <w:rPr>
+          <w:rFonts w:ascii="Times New Roman" w:hAnsi="Times New Roman" w:cs="Times New Roman"/>
+        </w:rPr>
+        <w:t>Start adjusting page layout with CSS</w:t>
+      </w:r>
     </w:p>
     <w:p>
       <w:pPr>
@@ -1925,6 +1951,12 @@
         </w:rPr>
         <w:t xml:space="preserve"> </w:t>
       </w:r>
+      <w:r>
+        <w:rPr>
+          <w:rFonts w:ascii="Times New Roman" w:hAnsi="Times New Roman" w:cs="Times New Roman"/>
+        </w:rPr>
+        <w:t>homepage.html, moduleOne.css</w:t>
+      </w:r>
     </w:p>
     <w:p>
       <w:pPr>
@@ -1947,6 +1979,30 @@
         </w:rPr>
         <w:t xml:space="preserve"> </w:t>
       </w:r>
+      <w:r>
+        <w:rPr>
+          <w:rFonts w:ascii="Times New Roman" w:hAnsi="Times New Roman" w:cs="Times New Roman"/>
+        </w:rPr>
+        <w:t xml:space="preserve">I </w:t>
+      </w:r>
+      <w:r>
+        <w:rPr>
+          <w:rFonts w:ascii="Times New Roman" w:hAnsi="Times New Roman" w:cs="Times New Roman"/>
+        </w:rPr>
+        <w:t xml:space="preserve">want to </w:t>
+      </w:r>
+      <w:r>
+        <w:rPr>
+          <w:rFonts w:ascii="Times New Roman" w:hAnsi="Times New Roman" w:cs="Times New Roman"/>
+        </w:rPr>
+        <w:t xml:space="preserve">align my navigation pane </w:t>
+      </w:r>
+      <w:r>
+        <w:rPr>
+          <w:rFonts w:ascii="Times New Roman" w:hAnsi="Times New Roman" w:cs="Times New Roman"/>
+        </w:rPr>
+        <w:t>using a nav element selector since this is the only navigation pane I have across any of my pages</w:t>
+      </w:r>
     </w:p>
     <w:p>
       <w:pPr>
@@ -1969,6 +2025,12 @@
         </w:rPr>
         <w:t xml:space="preserve"> </w:t>
       </w:r>
+      <w:r>
+        <w:rPr>
+          <w:rFonts w:ascii="Times New Roman" w:hAnsi="Times New Roman" w:cs="Times New Roman"/>
+        </w:rPr>
+        <w:t xml:space="preserve">The model agreed with using the nav selector and then suggested some property-value pairs to include for positioning the pane. </w:t>
+      </w:r>
     </w:p>
     <w:p>
       <w:pPr>
@@ -1985,6 +2047,376 @@
         </w:rPr>
         <w:t>How was the response used (directly, modified, discarded)? Explain.</w:t>
       </w:r>
+      <w:r>
+        <w:rPr>
+          <w:rFonts w:ascii="Times New Roman" w:hAnsi="Times New Roman" w:cs="Times New Roman"/>
+          <w:b/>
+          <w:bCs/>
+        </w:rPr>
+        <w:t xml:space="preserve"> </w:t>
+      </w:r>
+      <w:r>
+        <w:rPr>
+          <w:rFonts w:ascii="Times New Roman" w:hAnsi="Times New Roman" w:cs="Times New Roman"/>
+        </w:rPr>
+        <w:t>I tried the suggested property-value pairs, but they did not provide me with the results I desired. I asked the model for additional help (see next entry).</w:t>
+      </w:r>
+    </w:p>
+    <w:p>
+      <w:pPr>
+        <w:rPr>
+          <w:rFonts w:ascii="Times New Roman" w:hAnsi="Times New Roman" w:cs="Times New Roman"/>
+          <w:b/>
+          <w:bCs/>
+        </w:rPr>
+      </w:pPr>
+      <w:r>
+        <w:rPr>
+          <w:rFonts w:ascii="Times New Roman" w:hAnsi="Times New Roman" w:cs="Times New Roman"/>
+          <w:b/>
+          <w:bCs/>
+        </w:rPr>
+        <w:br w:type="page"/>
+      </w:r>
+    </w:p>
+    <w:p>
+      <w:pPr>
+        <w:spacing w:line="480" w:lineRule="auto"/>
+        <w:rPr>
+          <w:rFonts w:ascii="Times New Roman" w:hAnsi="Times New Roman" w:cs="Times New Roman"/>
+        </w:rPr>
+      </w:pPr>
+      <w:r>
+        <w:rPr>
+          <w:rFonts w:ascii="Times New Roman" w:hAnsi="Times New Roman" w:cs="Times New Roman"/>
+          <w:b/>
+          <w:bCs/>
+        </w:rPr>
+        <w:lastRenderedPageBreak/>
+        <w:t>AI Tool used:</w:t>
+      </w:r>
+      <w:r>
+        <w:rPr>
+          <w:rFonts w:ascii="Times New Roman" w:hAnsi="Times New Roman" w:cs="Times New Roman"/>
+        </w:rPr>
+        <w:t xml:space="preserve"> </w:t>
+      </w:r>
+      <w:r>
+        <w:rPr>
+          <w:rFonts w:ascii="Times New Roman" w:hAnsi="Times New Roman" w:cs="Times New Roman"/>
+        </w:rPr>
+        <w:t>ChatGPT</w:t>
+      </w:r>
+    </w:p>
+    <w:p>
+      <w:pPr>
+        <w:spacing w:line="480" w:lineRule="auto"/>
+        <w:rPr>
+          <w:rFonts w:ascii="Times New Roman" w:hAnsi="Times New Roman" w:cs="Times New Roman"/>
+        </w:rPr>
+      </w:pPr>
+      <w:r>
+        <w:rPr>
+          <w:rFonts w:ascii="Times New Roman" w:hAnsi="Times New Roman" w:cs="Times New Roman"/>
+          <w:b/>
+          <w:bCs/>
+        </w:rPr>
+        <w:t>Task being performed:</w:t>
+      </w:r>
+      <w:r>
+        <w:rPr>
+          <w:rFonts w:ascii="Times New Roman" w:hAnsi="Times New Roman" w:cs="Times New Roman"/>
+        </w:rPr>
+        <w:t xml:space="preserve"> </w:t>
+      </w:r>
+      <w:r>
+        <w:rPr>
+          <w:rFonts w:ascii="Times New Roman" w:hAnsi="Times New Roman" w:cs="Times New Roman"/>
+        </w:rPr>
+        <w:t>Moving the navigation pane underneath the header (adjusting layout via CSS)</w:t>
+      </w:r>
+    </w:p>
+    <w:p>
+      <w:pPr>
+        <w:spacing w:line="480" w:lineRule="auto"/>
+        <w:rPr>
+          <w:rFonts w:ascii="Times New Roman" w:hAnsi="Times New Roman" w:cs="Times New Roman"/>
+        </w:rPr>
+      </w:pPr>
+      <w:r>
+        <w:rPr>
+          <w:rFonts w:ascii="Times New Roman" w:hAnsi="Times New Roman" w:cs="Times New Roman"/>
+          <w:b/>
+          <w:bCs/>
+        </w:rPr>
+        <w:t>File associated with task:</w:t>
+      </w:r>
+      <w:r>
+        <w:rPr>
+          <w:rFonts w:ascii="Times New Roman" w:hAnsi="Times New Roman" w:cs="Times New Roman"/>
+        </w:rPr>
+        <w:t xml:space="preserve"> </w:t>
+      </w:r>
+      <w:r>
+        <w:rPr>
+          <w:rFonts w:ascii="Times New Roman" w:hAnsi="Times New Roman" w:cs="Times New Roman"/>
+        </w:rPr>
+        <w:t>moduleOne.css, homepage.html</w:t>
+      </w:r>
+    </w:p>
+    <w:p>
+      <w:pPr>
+        <w:spacing w:line="480" w:lineRule="auto"/>
+        <w:rPr>
+          <w:rFonts w:ascii="Times New Roman" w:hAnsi="Times New Roman" w:cs="Times New Roman"/>
+        </w:rPr>
+      </w:pPr>
+      <w:r>
+        <w:rPr>
+          <w:rFonts w:ascii="Times New Roman" w:hAnsi="Times New Roman" w:cs="Times New Roman"/>
+          <w:b/>
+          <w:bCs/>
+        </w:rPr>
+        <w:t>Prompt/question provided:</w:t>
+      </w:r>
+      <w:r>
+        <w:rPr>
+          <w:rFonts w:ascii="Times New Roman" w:hAnsi="Times New Roman" w:cs="Times New Roman"/>
+        </w:rPr>
+        <w:t xml:space="preserve"> </w:t>
+      </w:r>
+      <w:r>
+        <w:rPr>
+          <w:rFonts w:ascii="Times New Roman" w:hAnsi="Times New Roman" w:cs="Times New Roman"/>
+        </w:rPr>
+        <w:t xml:space="preserve">I </w:t>
+      </w:r>
+      <w:r>
+        <w:rPr>
+          <w:rFonts w:ascii="Times New Roman" w:hAnsi="Times New Roman" w:cs="Times New Roman"/>
+        </w:rPr>
+        <w:t>need the navigation pane to be underneath my header, right now it is on top of the header</w:t>
+      </w:r>
+    </w:p>
+    <w:p>
+      <w:pPr>
+        <w:spacing w:line="480" w:lineRule="auto"/>
+        <w:rPr>
+          <w:rFonts w:ascii="Times New Roman" w:hAnsi="Times New Roman" w:cs="Times New Roman"/>
+        </w:rPr>
+      </w:pPr>
+      <w:r>
+        <w:rPr>
+          <w:rFonts w:ascii="Times New Roman" w:hAnsi="Times New Roman" w:cs="Times New Roman"/>
+          <w:b/>
+          <w:bCs/>
+        </w:rPr>
+        <w:t>Summary of the response:</w:t>
+      </w:r>
+      <w:r>
+        <w:rPr>
+          <w:rFonts w:ascii="Times New Roman" w:hAnsi="Times New Roman" w:cs="Times New Roman"/>
+        </w:rPr>
+        <w:t xml:space="preserve"> </w:t>
+      </w:r>
+      <w:r>
+        <w:rPr>
+          <w:rFonts w:ascii="Times New Roman" w:hAnsi="Times New Roman" w:cs="Times New Roman"/>
+        </w:rPr>
+        <w:t>The model suggested using a fixed top value in my nav selector to make sure the pane is always directed underneath the header (assuming the top value is equal to the value I set for my header height).</w:t>
+      </w:r>
+    </w:p>
+    <w:p>
+      <w:pPr>
+        <w:spacing w:line="480" w:lineRule="auto"/>
+        <w:rPr>
+          <w:rFonts w:ascii="Times New Roman" w:hAnsi="Times New Roman" w:cs="Times New Roman"/>
+        </w:rPr>
+      </w:pPr>
+      <w:r>
+        <w:rPr>
+          <w:rFonts w:ascii="Times New Roman" w:hAnsi="Times New Roman" w:cs="Times New Roman"/>
+          <w:b/>
+          <w:bCs/>
+        </w:rPr>
+        <w:t>How was the response used (directly, modified, discarded)? Explain.</w:t>
+      </w:r>
+      <w:r>
+        <w:rPr>
+          <w:rFonts w:ascii="Times New Roman" w:hAnsi="Times New Roman" w:cs="Times New Roman"/>
+          <w:b/>
+          <w:bCs/>
+        </w:rPr>
+        <w:t xml:space="preserve"> </w:t>
+      </w:r>
+      <w:r>
+        <w:rPr>
+          <w:rFonts w:ascii="Times New Roman" w:hAnsi="Times New Roman" w:cs="Times New Roman"/>
+        </w:rPr>
+        <w:t xml:space="preserve">I used this response to mess around with my CSS some more and </w:t>
+      </w:r>
+      <w:r>
+        <w:rPr>
+          <w:rFonts w:ascii="Times New Roman" w:hAnsi="Times New Roman" w:cs="Times New Roman"/>
+        </w:rPr>
+        <w:t xml:space="preserve">position my navigation pane until I got more comfortable with the way it looked and the property-value pairs I used to achieve it. </w:t>
+      </w:r>
+    </w:p>
+    <w:p>
+      <w:pPr>
+        <w:rPr>
+          <w:rFonts w:ascii="Times New Roman" w:hAnsi="Times New Roman" w:cs="Times New Roman"/>
+        </w:rPr>
+      </w:pPr>
+      <w:r>
+        <w:rPr>
+          <w:rFonts w:ascii="Times New Roman" w:hAnsi="Times New Roman" w:cs="Times New Roman"/>
+        </w:rPr>
+        <w:br w:type="page"/>
+      </w:r>
+    </w:p>
+    <w:p>
+      <w:pPr>
+        <w:spacing w:line="480" w:lineRule="auto"/>
+        <w:rPr>
+          <w:rFonts w:ascii="Times New Roman" w:hAnsi="Times New Roman" w:cs="Times New Roman"/>
+        </w:rPr>
+      </w:pPr>
+      <w:r>
+        <w:rPr>
+          <w:rFonts w:ascii="Times New Roman" w:hAnsi="Times New Roman" w:cs="Times New Roman"/>
+          <w:b/>
+          <w:bCs/>
+        </w:rPr>
+        <w:lastRenderedPageBreak/>
+        <w:t>AI Tool used:</w:t>
+      </w:r>
+      <w:r>
+        <w:rPr>
+          <w:rFonts w:ascii="Times New Roman" w:hAnsi="Times New Roman" w:cs="Times New Roman"/>
+        </w:rPr>
+        <w:t xml:space="preserve"> </w:t>
+      </w:r>
+    </w:p>
+    <w:p>
+      <w:pPr>
+        <w:spacing w:line="480" w:lineRule="auto"/>
+        <w:rPr>
+          <w:rFonts w:ascii="Times New Roman" w:hAnsi="Times New Roman" w:cs="Times New Roman"/>
+        </w:rPr>
+      </w:pPr>
+      <w:r>
+        <w:rPr>
+          <w:rFonts w:ascii="Times New Roman" w:hAnsi="Times New Roman" w:cs="Times New Roman"/>
+          <w:b/>
+          <w:bCs/>
+        </w:rPr>
+        <w:t>Task being performed:</w:t>
+      </w:r>
+      <w:r>
+        <w:rPr>
+          <w:rFonts w:ascii="Times New Roman" w:hAnsi="Times New Roman" w:cs="Times New Roman"/>
+        </w:rPr>
+        <w:t xml:space="preserve"> </w:t>
+      </w:r>
+    </w:p>
+    <w:p>
+      <w:pPr>
+        <w:spacing w:line="480" w:lineRule="auto"/>
+        <w:rPr>
+          <w:rFonts w:ascii="Times New Roman" w:hAnsi="Times New Roman" w:cs="Times New Roman"/>
+        </w:rPr>
+      </w:pPr>
+      <w:r>
+        <w:rPr>
+          <w:rFonts w:ascii="Times New Roman" w:hAnsi="Times New Roman" w:cs="Times New Roman"/>
+          <w:b/>
+          <w:bCs/>
+        </w:rPr>
+        <w:t>File associated with task:</w:t>
+      </w:r>
+      <w:r>
+        <w:rPr>
+          <w:rFonts w:ascii="Times New Roman" w:hAnsi="Times New Roman" w:cs="Times New Roman"/>
+        </w:rPr>
+        <w:t xml:space="preserve"> </w:t>
+      </w:r>
+    </w:p>
+    <w:p>
+      <w:pPr>
+        <w:spacing w:line="480" w:lineRule="auto"/>
+        <w:rPr>
+          <w:rFonts w:ascii="Times New Roman" w:hAnsi="Times New Roman" w:cs="Times New Roman"/>
+        </w:rPr>
+      </w:pPr>
+      <w:r>
+        <w:rPr>
+          <w:rFonts w:ascii="Times New Roman" w:hAnsi="Times New Roman" w:cs="Times New Roman"/>
+          <w:b/>
+          <w:bCs/>
+        </w:rPr>
+        <w:t>Prompt/question provided:</w:t>
+      </w:r>
+      <w:r>
+        <w:rPr>
+          <w:rFonts w:ascii="Times New Roman" w:hAnsi="Times New Roman" w:cs="Times New Roman"/>
+        </w:rPr>
+        <w:t xml:space="preserve"> </w:t>
+      </w:r>
+    </w:p>
+    <w:p>
+      <w:pPr>
+        <w:spacing w:line="480" w:lineRule="auto"/>
+        <w:rPr>
+          <w:rFonts w:ascii="Times New Roman" w:hAnsi="Times New Roman" w:cs="Times New Roman"/>
+        </w:rPr>
+      </w:pPr>
+      <w:r>
+        <w:rPr>
+          <w:rFonts w:ascii="Times New Roman" w:hAnsi="Times New Roman" w:cs="Times New Roman"/>
+          <w:b/>
+          <w:bCs/>
+        </w:rPr>
+        <w:t>Summary of the response:</w:t>
+      </w:r>
+      <w:r>
+        <w:rPr>
+          <w:rFonts w:ascii="Times New Roman" w:hAnsi="Times New Roman" w:cs="Times New Roman"/>
+        </w:rPr>
+        <w:t xml:space="preserve"> </w:t>
+      </w:r>
+    </w:p>
+    <w:p>
+      <w:pPr>
+        <w:spacing w:line="480" w:lineRule="auto"/>
+        <w:rPr>
+          <w:rFonts w:ascii="Times New Roman" w:hAnsi="Times New Roman" w:cs="Times New Roman"/>
+        </w:rPr>
+      </w:pPr>
+      <w:r>
+        <w:rPr>
+          <w:rFonts w:ascii="Times New Roman" w:hAnsi="Times New Roman" w:cs="Times New Roman"/>
+          <w:b/>
+          <w:bCs/>
+        </w:rPr>
+        <w:t>How was the response used (directly, modified, discarded)? Explain.</w:t>
+      </w:r>
+    </w:p>
+    <w:p>
+      <w:pPr>
+        <w:spacing w:line="480" w:lineRule="auto"/>
+        <w:rPr>
+          <w:rFonts w:ascii="Times New Roman" w:hAnsi="Times New Roman" w:cs="Times New Roman"/>
+        </w:rPr>
+      </w:pPr>
+    </w:p>
+    <w:p>
+      <w:pPr>
+        <w:spacing w:line="480" w:lineRule="auto"/>
+        <w:rPr>
+          <w:rFonts w:ascii="Times New Roman" w:hAnsi="Times New Roman" w:cs="Times New Roman"/>
+        </w:rPr>
+      </w:pPr>
     </w:p>
     <w:p>
       <w:pPr>

</xml_diff>

<commit_message>
Worked on CSS, fixed some different elements across pages
Our CSS is mostly done. We have met all of the basic requirements, but likely want to spend some more time making the site look better. My next step will be making sure all pages have the same header link (back to the home page) and doing other QA work before continuing to mess with the CSS.
</commit_message>
<xml_diff>
--- a/CSCI 330 Carrier Module One AI Usage Report.docx
+++ b/CSCI 330 Carrier Module One AI Usage Report.docx
@@ -1371,21 +1371,7 @@
         <w:rPr>
           <w:rFonts w:ascii="Times New Roman" w:hAnsi="Times New Roman" w:cs="Times New Roman"/>
         </w:rPr>
-        <w:t>you just have to create a file ending with .</w:t>
-      </w:r>
-      <w:proofErr w:type="spellStart"/>
-      <w:r>
-        <w:rPr>
-          <w:rFonts w:ascii="Times New Roman" w:hAnsi="Times New Roman" w:cs="Times New Roman"/>
-        </w:rPr>
-        <w:t>css</w:t>
-      </w:r>
-      <w:proofErr w:type="spellEnd"/>
-      <w:r>
-        <w:rPr>
-          <w:rFonts w:ascii="Times New Roman" w:hAnsi="Times New Roman" w:cs="Times New Roman"/>
-        </w:rPr>
-        <w:t xml:space="preserve">. From there, you can </w:t>
+        <w:t xml:space="preserve">you just have to create a file ending with .css. From there, you can </w:t>
       </w:r>
       <w:r>
         <w:rPr>
@@ -2297,6 +2283,12 @@
         </w:rPr>
         <w:t xml:space="preserve"> </w:t>
       </w:r>
+      <w:r>
+        <w:rPr>
+          <w:rFonts w:ascii="Times New Roman" w:hAnsi="Times New Roman" w:cs="Times New Roman"/>
+        </w:rPr>
+        <w:t>ChatGPT</w:t>
+      </w:r>
     </w:p>
     <w:p>
       <w:pPr>
@@ -2319,6 +2311,18 @@
         </w:rPr>
         <w:t xml:space="preserve"> </w:t>
       </w:r>
+      <w:r>
+        <w:rPr>
+          <w:rFonts w:ascii="Times New Roman" w:hAnsi="Times New Roman" w:cs="Times New Roman"/>
+        </w:rPr>
+        <w:t xml:space="preserve">adjusting </w:t>
+      </w:r>
+      <w:r>
+        <w:rPr>
+          <w:rFonts w:ascii="Times New Roman" w:hAnsi="Times New Roman" w:cs="Times New Roman"/>
+        </w:rPr>
+        <w:t>position of navigation pane</w:t>
+      </w:r>
     </w:p>
     <w:p>
       <w:pPr>
@@ -2341,6 +2345,18 @@
         </w:rPr>
         <w:t xml:space="preserve"> </w:t>
       </w:r>
+      <w:r>
+        <w:rPr>
+          <w:rFonts w:ascii="Times New Roman" w:hAnsi="Times New Roman" w:cs="Times New Roman"/>
+        </w:rPr>
+        <w:t xml:space="preserve">moduleOne.css, </w:t>
+      </w:r>
+      <w:r>
+        <w:rPr>
+          <w:rFonts w:ascii="Times New Roman" w:hAnsi="Times New Roman" w:cs="Times New Roman"/>
+        </w:rPr>
+        <w:t>homepage.html</w:t>
+      </w:r>
     </w:p>
     <w:p>
       <w:pPr>
@@ -2363,6 +2379,18 @@
         </w:rPr>
         <w:t xml:space="preserve"> </w:t>
       </w:r>
+      <w:r>
+        <w:rPr>
+          <w:rFonts w:ascii="Times New Roman" w:hAnsi="Times New Roman" w:cs="Times New Roman"/>
+        </w:rPr>
+        <w:t xml:space="preserve">I </w:t>
+      </w:r>
+      <w:r>
+        <w:rPr>
+          <w:rFonts w:ascii="Times New Roman" w:hAnsi="Times New Roman" w:cs="Times New Roman"/>
+        </w:rPr>
+        <w:t>can't get my "main" content to be at the same height as my nav pane. I want both to start right beneath the header, with the nav pane on the left and my main right beside the pane</w:t>
+      </w:r>
     </w:p>
     <w:p>
       <w:pPr>
@@ -2385,6 +2413,18 @@
         </w:rPr>
         <w:t xml:space="preserve"> </w:t>
       </w:r>
+      <w:r>
+        <w:rPr>
+          <w:rFonts w:ascii="Times New Roman" w:hAnsi="Times New Roman" w:cs="Times New Roman"/>
+        </w:rPr>
+        <w:t xml:space="preserve">The model suggested I use </w:t>
+      </w:r>
+      <w:r>
+        <w:rPr>
+          <w:rFonts w:ascii="Times New Roman" w:hAnsi="Times New Roman" w:cs="Times New Roman"/>
+        </w:rPr>
+        <w:t xml:space="preserve">the float property to allow the other content to flow beside the navigation pane. </w:t>
+      </w:r>
     </w:p>
     <w:p>
       <w:pPr>
@@ -2401,6 +2441,448 @@
         </w:rPr>
         <w:t>How was the response used (directly, modified, discarded)? Explain.</w:t>
       </w:r>
+      <w:r>
+        <w:rPr>
+          <w:rFonts w:ascii="Times New Roman" w:hAnsi="Times New Roman" w:cs="Times New Roman"/>
+          <w:b/>
+          <w:bCs/>
+        </w:rPr>
+        <w:t xml:space="preserve"> </w:t>
+      </w:r>
+      <w:r>
+        <w:rPr>
+          <w:rFonts w:ascii="Times New Roman" w:hAnsi="Times New Roman" w:cs="Times New Roman"/>
+        </w:rPr>
+        <w:t xml:space="preserve">I added the float property into my CSS under the </w:t>
+      </w:r>
+      <w:r>
+        <w:rPr>
+          <w:rFonts w:ascii="Times New Roman" w:hAnsi="Times New Roman" w:cs="Times New Roman"/>
+        </w:rPr>
+        <w:t>nav selectors.</w:t>
+      </w:r>
+    </w:p>
+    <w:p>
+      <w:pPr>
+        <w:rPr>
+          <w:rFonts w:ascii="Times New Roman" w:hAnsi="Times New Roman" w:cs="Times New Roman"/>
+          <w:b/>
+          <w:bCs/>
+        </w:rPr>
+      </w:pPr>
+      <w:r>
+        <w:rPr>
+          <w:rFonts w:ascii="Times New Roman" w:hAnsi="Times New Roman" w:cs="Times New Roman"/>
+          <w:b/>
+          <w:bCs/>
+        </w:rPr>
+        <w:br w:type="page"/>
+      </w:r>
+    </w:p>
+    <w:p>
+      <w:pPr>
+        <w:spacing w:line="480" w:lineRule="auto"/>
+        <w:rPr>
+          <w:rFonts w:ascii="Times New Roman" w:hAnsi="Times New Roman" w:cs="Times New Roman"/>
+        </w:rPr>
+      </w:pPr>
+      <w:r>
+        <w:rPr>
+          <w:rFonts w:ascii="Times New Roman" w:hAnsi="Times New Roman" w:cs="Times New Roman"/>
+          <w:b/>
+          <w:bCs/>
+        </w:rPr>
+        <w:lastRenderedPageBreak/>
+        <w:t>AI Tool used:</w:t>
+      </w:r>
+      <w:r>
+        <w:rPr>
+          <w:rFonts w:ascii="Times New Roman" w:hAnsi="Times New Roman" w:cs="Times New Roman"/>
+        </w:rPr>
+        <w:t xml:space="preserve"> </w:t>
+      </w:r>
+      <w:r>
+        <w:rPr>
+          <w:rFonts w:ascii="Times New Roman" w:hAnsi="Times New Roman" w:cs="Times New Roman"/>
+        </w:rPr>
+        <w:t>ChatGPT</w:t>
+      </w:r>
+    </w:p>
+    <w:p>
+      <w:pPr>
+        <w:spacing w:line="480" w:lineRule="auto"/>
+        <w:rPr>
+          <w:rFonts w:ascii="Times New Roman" w:hAnsi="Times New Roman" w:cs="Times New Roman"/>
+        </w:rPr>
+      </w:pPr>
+      <w:r>
+        <w:rPr>
+          <w:rFonts w:ascii="Times New Roman" w:hAnsi="Times New Roman" w:cs="Times New Roman"/>
+          <w:b/>
+          <w:bCs/>
+        </w:rPr>
+        <w:t>Task being performed:</w:t>
+      </w:r>
+      <w:r>
+        <w:rPr>
+          <w:rFonts w:ascii="Times New Roman" w:hAnsi="Times New Roman" w:cs="Times New Roman"/>
+        </w:rPr>
+        <w:t xml:space="preserve"> </w:t>
+      </w:r>
+      <w:r>
+        <w:rPr>
+          <w:rFonts w:ascii="Times New Roman" w:hAnsi="Times New Roman" w:cs="Times New Roman"/>
+        </w:rPr>
+        <w:t>still adjusting my navigation pane</w:t>
+      </w:r>
+    </w:p>
+    <w:p>
+      <w:pPr>
+        <w:spacing w:line="480" w:lineRule="auto"/>
+        <w:rPr>
+          <w:rFonts w:ascii="Times New Roman" w:hAnsi="Times New Roman" w:cs="Times New Roman"/>
+        </w:rPr>
+      </w:pPr>
+      <w:r>
+        <w:rPr>
+          <w:rFonts w:ascii="Times New Roman" w:hAnsi="Times New Roman" w:cs="Times New Roman"/>
+          <w:b/>
+          <w:bCs/>
+        </w:rPr>
+        <w:t>File associated with task:</w:t>
+      </w:r>
+      <w:r>
+        <w:rPr>
+          <w:rFonts w:ascii="Times New Roman" w:hAnsi="Times New Roman" w:cs="Times New Roman"/>
+        </w:rPr>
+        <w:t xml:space="preserve"> </w:t>
+      </w:r>
+      <w:r>
+        <w:rPr>
+          <w:rFonts w:ascii="Times New Roman" w:hAnsi="Times New Roman" w:cs="Times New Roman"/>
+        </w:rPr>
+        <w:t>moduleOne.css, homepage.html</w:t>
+      </w:r>
+    </w:p>
+    <w:p>
+      <w:pPr>
+        <w:spacing w:line="480" w:lineRule="auto"/>
+        <w:rPr>
+          <w:rFonts w:ascii="Times New Roman" w:hAnsi="Times New Roman" w:cs="Times New Roman"/>
+        </w:rPr>
+      </w:pPr>
+      <w:r>
+        <w:rPr>
+          <w:rFonts w:ascii="Times New Roman" w:hAnsi="Times New Roman" w:cs="Times New Roman"/>
+          <w:b/>
+          <w:bCs/>
+        </w:rPr>
+        <w:t>Prompt/question provided:</w:t>
+      </w:r>
+      <w:r>
+        <w:rPr>
+          <w:rFonts w:ascii="Times New Roman" w:hAnsi="Times New Roman" w:cs="Times New Roman"/>
+        </w:rPr>
+        <w:t xml:space="preserve"> </w:t>
+      </w:r>
+      <w:r>
+        <w:rPr>
+          <w:rFonts w:ascii="Times New Roman" w:hAnsi="Times New Roman" w:cs="Times New Roman"/>
+        </w:rPr>
+        <w:t>T</w:t>
+      </w:r>
+      <w:r>
+        <w:rPr>
+          <w:rFonts w:ascii="Times New Roman" w:hAnsi="Times New Roman" w:cs="Times New Roman"/>
+        </w:rPr>
+        <w:t>hat’s</w:t>
+      </w:r>
+      <w:r>
+        <w:rPr>
+          <w:rFonts w:ascii="Times New Roman" w:hAnsi="Times New Roman" w:cs="Times New Roman"/>
+        </w:rPr>
+        <w:t xml:space="preserve"> closer, but they still aren't exactly at the same height. I want the first piece of the nav pane to be in line with the first piece of the content in main. </w:t>
+      </w:r>
+      <w:r>
+        <w:rPr>
+          <w:rFonts w:ascii="Times New Roman" w:hAnsi="Times New Roman" w:cs="Times New Roman"/>
+        </w:rPr>
+        <w:t>I</w:t>
+      </w:r>
+      <w:r>
+        <w:rPr>
+          <w:rFonts w:ascii="Times New Roman" w:hAnsi="Times New Roman" w:cs="Times New Roman"/>
+        </w:rPr>
+        <w:t xml:space="preserve"> thought setting their top properties to the same value would fix this, but that didn't help</w:t>
+      </w:r>
+    </w:p>
+    <w:p>
+      <w:pPr>
+        <w:spacing w:line="480" w:lineRule="auto"/>
+        <w:rPr>
+          <w:rFonts w:ascii="Times New Roman" w:hAnsi="Times New Roman" w:cs="Times New Roman"/>
+        </w:rPr>
+      </w:pPr>
+      <w:r>
+        <w:rPr>
+          <w:rFonts w:ascii="Times New Roman" w:hAnsi="Times New Roman" w:cs="Times New Roman"/>
+          <w:b/>
+          <w:bCs/>
+        </w:rPr>
+        <w:t>Summary of the response:</w:t>
+      </w:r>
+      <w:r>
+        <w:rPr>
+          <w:rFonts w:ascii="Times New Roman" w:hAnsi="Times New Roman" w:cs="Times New Roman"/>
+        </w:rPr>
+        <w:t xml:space="preserve"> </w:t>
+      </w:r>
+      <w:r>
+        <w:rPr>
+          <w:rFonts w:ascii="Times New Roman" w:hAnsi="Times New Roman" w:cs="Times New Roman"/>
+        </w:rPr>
+        <w:t xml:space="preserve">The model pointed out that heading tags can sometimes throw off the top margins since they come with a default value. It suggested I fix this by </w:t>
+      </w:r>
+      <w:r>
+        <w:rPr>
+          <w:rFonts w:ascii="Times New Roman" w:hAnsi="Times New Roman" w:cs="Times New Roman"/>
+        </w:rPr>
+        <w:t xml:space="preserve">using a </w:t>
+      </w:r>
+      <w:r>
+        <w:rPr>
+          <w:rFonts w:ascii="Times New Roman" w:hAnsi="Times New Roman" w:cs="Times New Roman"/>
+        </w:rPr>
+        <w:t>descendant</w:t>
+      </w:r>
+      <w:r>
+        <w:rPr>
+          <w:rFonts w:ascii="Times New Roman" w:hAnsi="Times New Roman" w:cs="Times New Roman"/>
+        </w:rPr>
+        <w:t xml:space="preserve"> selector</w:t>
+      </w:r>
+      <w:r>
+        <w:rPr>
+          <w:rFonts w:ascii="Times New Roman" w:hAnsi="Times New Roman" w:cs="Times New Roman"/>
+        </w:rPr>
+        <w:t xml:space="preserve"> to set the top margin for all header elements in the main tags </w:t>
+      </w:r>
+      <w:r>
+        <w:rPr>
+          <w:rFonts w:ascii="Times New Roman" w:hAnsi="Times New Roman" w:cs="Times New Roman"/>
+        </w:rPr>
+        <w:t xml:space="preserve">to 0. </w:t>
+      </w:r>
+      <w:r>
+        <w:rPr>
+          <w:rFonts w:ascii="Times New Roman" w:hAnsi="Times New Roman" w:cs="Times New Roman"/>
+        </w:rPr>
+        <w:t xml:space="preserve"> </w:t>
+      </w:r>
+    </w:p>
+    <w:p>
+      <w:pPr>
+        <w:spacing w:line="480" w:lineRule="auto"/>
+        <w:rPr>
+          <w:rFonts w:ascii="Times New Roman" w:hAnsi="Times New Roman" w:cs="Times New Roman"/>
+        </w:rPr>
+      </w:pPr>
+      <w:r>
+        <w:rPr>
+          <w:rFonts w:ascii="Times New Roman" w:hAnsi="Times New Roman" w:cs="Times New Roman"/>
+          <w:b/>
+          <w:bCs/>
+        </w:rPr>
+        <w:t>How was the response used (directly, modified, discarded)? Explain.</w:t>
+      </w:r>
+      <w:r>
+        <w:rPr>
+          <w:rFonts w:ascii="Times New Roman" w:hAnsi="Times New Roman" w:cs="Times New Roman"/>
+          <w:b/>
+          <w:bCs/>
+        </w:rPr>
+        <w:t xml:space="preserve"> </w:t>
+      </w:r>
+      <w:r>
+        <w:rPr>
+          <w:rFonts w:ascii="Times New Roman" w:hAnsi="Times New Roman" w:cs="Times New Roman"/>
+        </w:rPr>
+        <w:t xml:space="preserve">I changed my headings in my html files to all be the same within the main tags, and then I used a descendant selector to </w:t>
+      </w:r>
+      <w:r>
+        <w:rPr>
+          <w:rFonts w:ascii="Times New Roman" w:hAnsi="Times New Roman" w:cs="Times New Roman"/>
+        </w:rPr>
+        <w:t>restrict their top margins.</w:t>
+      </w:r>
+    </w:p>
+    <w:p>
+      <w:pPr>
+        <w:rPr>
+          <w:rFonts w:ascii="Times New Roman" w:hAnsi="Times New Roman" w:cs="Times New Roman"/>
+          <w:b/>
+          <w:bCs/>
+        </w:rPr>
+      </w:pPr>
+      <w:r>
+        <w:rPr>
+          <w:rFonts w:ascii="Times New Roman" w:hAnsi="Times New Roman" w:cs="Times New Roman"/>
+          <w:b/>
+          <w:bCs/>
+        </w:rPr>
+        <w:br w:type="page"/>
+      </w:r>
+    </w:p>
+    <w:p>
+      <w:pPr>
+        <w:spacing w:line="480" w:lineRule="auto"/>
+        <w:rPr>
+          <w:rFonts w:ascii="Times New Roman" w:hAnsi="Times New Roman" w:cs="Times New Roman"/>
+        </w:rPr>
+      </w:pPr>
+      <w:r>
+        <w:rPr>
+          <w:rFonts w:ascii="Times New Roman" w:hAnsi="Times New Roman" w:cs="Times New Roman"/>
+          <w:b/>
+          <w:bCs/>
+        </w:rPr>
+        <w:lastRenderedPageBreak/>
+        <w:t>AI Tool used:</w:t>
+      </w:r>
+      <w:r>
+        <w:rPr>
+          <w:rFonts w:ascii="Times New Roman" w:hAnsi="Times New Roman" w:cs="Times New Roman"/>
+        </w:rPr>
+        <w:t xml:space="preserve"> </w:t>
+      </w:r>
+    </w:p>
+    <w:p>
+      <w:pPr>
+        <w:spacing w:line="480" w:lineRule="auto"/>
+        <w:rPr>
+          <w:rFonts w:ascii="Times New Roman" w:hAnsi="Times New Roman" w:cs="Times New Roman"/>
+        </w:rPr>
+      </w:pPr>
+      <w:r>
+        <w:rPr>
+          <w:rFonts w:ascii="Times New Roman" w:hAnsi="Times New Roman" w:cs="Times New Roman"/>
+          <w:b/>
+          <w:bCs/>
+        </w:rPr>
+        <w:t>Task being performed:</w:t>
+      </w:r>
+      <w:r>
+        <w:rPr>
+          <w:rFonts w:ascii="Times New Roman" w:hAnsi="Times New Roman" w:cs="Times New Roman"/>
+        </w:rPr>
+        <w:t xml:space="preserve"> </w:t>
+      </w:r>
+    </w:p>
+    <w:p>
+      <w:pPr>
+        <w:spacing w:line="480" w:lineRule="auto"/>
+        <w:rPr>
+          <w:rFonts w:ascii="Times New Roman" w:hAnsi="Times New Roman" w:cs="Times New Roman"/>
+        </w:rPr>
+      </w:pPr>
+      <w:r>
+        <w:rPr>
+          <w:rFonts w:ascii="Times New Roman" w:hAnsi="Times New Roman" w:cs="Times New Roman"/>
+          <w:b/>
+          <w:bCs/>
+        </w:rPr>
+        <w:t>File associated with task:</w:t>
+      </w:r>
+      <w:r>
+        <w:rPr>
+          <w:rFonts w:ascii="Times New Roman" w:hAnsi="Times New Roman" w:cs="Times New Roman"/>
+        </w:rPr>
+        <w:t xml:space="preserve"> </w:t>
+      </w:r>
+    </w:p>
+    <w:p>
+      <w:pPr>
+        <w:spacing w:line="480" w:lineRule="auto"/>
+        <w:rPr>
+          <w:rFonts w:ascii="Times New Roman" w:hAnsi="Times New Roman" w:cs="Times New Roman"/>
+        </w:rPr>
+      </w:pPr>
+      <w:r>
+        <w:rPr>
+          <w:rFonts w:ascii="Times New Roman" w:hAnsi="Times New Roman" w:cs="Times New Roman"/>
+          <w:b/>
+          <w:bCs/>
+        </w:rPr>
+        <w:t>Prompt/question provided:</w:t>
+      </w:r>
+      <w:r>
+        <w:rPr>
+          <w:rFonts w:ascii="Times New Roman" w:hAnsi="Times New Roman" w:cs="Times New Roman"/>
+        </w:rPr>
+        <w:t xml:space="preserve"> </w:t>
+      </w:r>
+    </w:p>
+    <w:p>
+      <w:pPr>
+        <w:spacing w:line="480" w:lineRule="auto"/>
+        <w:rPr>
+          <w:rFonts w:ascii="Times New Roman" w:hAnsi="Times New Roman" w:cs="Times New Roman"/>
+        </w:rPr>
+      </w:pPr>
+      <w:r>
+        <w:rPr>
+          <w:rFonts w:ascii="Times New Roman" w:hAnsi="Times New Roman" w:cs="Times New Roman"/>
+          <w:b/>
+          <w:bCs/>
+        </w:rPr>
+        <w:t>Summary of the response:</w:t>
+      </w:r>
+      <w:r>
+        <w:rPr>
+          <w:rFonts w:ascii="Times New Roman" w:hAnsi="Times New Roman" w:cs="Times New Roman"/>
+        </w:rPr>
+        <w:t xml:space="preserve"> </w:t>
+      </w:r>
+    </w:p>
+    <w:p>
+      <w:pPr>
+        <w:spacing w:line="480" w:lineRule="auto"/>
+        <w:rPr>
+          <w:rFonts w:ascii="Times New Roman" w:hAnsi="Times New Roman" w:cs="Times New Roman"/>
+        </w:rPr>
+      </w:pPr>
+      <w:r>
+        <w:rPr>
+          <w:rFonts w:ascii="Times New Roman" w:hAnsi="Times New Roman" w:cs="Times New Roman"/>
+          <w:b/>
+          <w:bCs/>
+        </w:rPr>
+        <w:t>How was the response used (directly, modified, discarded)? Explain.</w:t>
+      </w:r>
+      <w:r>
+        <w:rPr>
+          <w:rFonts w:ascii="Times New Roman" w:hAnsi="Times New Roman" w:cs="Times New Roman"/>
+          <w:b/>
+          <w:bCs/>
+        </w:rPr>
+        <w:t xml:space="preserve"> </w:t>
+      </w:r>
+    </w:p>
+    <w:p>
+      <w:pPr>
+        <w:spacing w:line="480" w:lineRule="auto"/>
+        <w:rPr>
+          <w:rFonts w:ascii="Times New Roman" w:hAnsi="Times New Roman" w:cs="Times New Roman"/>
+        </w:rPr>
+      </w:pPr>
+    </w:p>
+    <w:p>
+      <w:pPr>
+        <w:spacing w:line="480" w:lineRule="auto"/>
+        <w:rPr>
+          <w:rFonts w:ascii="Times New Roman" w:hAnsi="Times New Roman" w:cs="Times New Roman"/>
+        </w:rPr>
+      </w:pPr>
     </w:p>
     <w:p>
       <w:pPr>

</xml_diff>